<commit_message>
Ranking top report final
</commit_message>
<xml_diff>
--- a/templates/gti_top_ranking_template.docx
+++ b/templates/gti_top_ranking_template.docx
@@ -59,6 +59,11 @@
       </w:r>
     </w:p>
     <w:p>
+      <w:r>
+        <w:t>Field coverage: {{ field_coverage_summary }}</w:t>
+      </w:r>
+    </w:p>
+    <w:p>
       <w:pPr>
         <w:pStyle w:val="Heading1"/>
       </w:pPr>
@@ -101,37 +106,7 @@
     </w:p>
     <w:p>
       <w:r>
-        <w:t>Ranking tables are inserted after template rendering from the computed result object.</w:t>
-      </w:r>
-    </w:p>
-    <w:p>
-      <w:r>
-        <w:t>Industry chart: {{ industry_chart_note }}</w:t>
-      </w:r>
-    </w:p>
-    <w:p>
-      <w:r>
-        <w:t>Targeted regions chart: {{ targeted_regions_chart_note }}</w:t>
-      </w:r>
-    </w:p>
-    <w:p>
-      <w:r>
-        <w:t>Source regions chart: {{ source_regions_chart_note }}</w:t>
-      </w:r>
-    </w:p>
-    <w:p>
-      <w:r>
-        <w:t>Tags chart: {{ tags_chart_note }}</w:t>
-      </w:r>
-    </w:p>
-    <w:p>
-      <w:r>
-        <w:t>Collection type chart: {{ collection_type_chart_note }}</w:t>
-      </w:r>
-    </w:p>
-    <w:p>
-      <w:r>
-        <w:t>Timeline chart: {{ timeline_chart_note }}</w:t>
+        <w:t>The ranking tables and charts below use already computed preview fields.</w:t>
       </w:r>
     </w:p>
     <w:p>
@@ -167,7 +142,7 @@
     </w:p>
     <w:p>
       <w:r>
-        <w:t>Field coverage is inserted after template rendering.</w:t>
+        <w:t>Detailed field coverage is included below.</w:t>
       </w:r>
     </w:p>
     <w:p>

</xml_diff>